<commit_message>
Embed dashboard chart images into report template
Co-Authored-By: Claude Sonnet 5.5 <noreply@anthropic.com>
Claude-Session: https://claude.ai/code/session_017RLvirTSx84UWnroqbbqTM
</commit_message>
<xml_diff>
--- a/output/Template_Laporan_UTS_BDASC.docx
+++ b/output/Template_Laporan_UTS_BDASC.docx
@@ -3356,6 +3356,278 @@
         <w:t xml:space="preserve">4.1.1 Revenue Report</w:t>
       </w:r>
     </w:p>
+    <w:p>
+      <w:pPr>
+        <w:spacing w:after="60" w:before="100"/>
+        <w:jc w:val="center"/>
+      </w:pPr>
+      <w:r>
+        <w:drawing>
+          <wp:inline distT="0" distB="0" distL="0" distR="0">
+            <wp:extent cx="5334000" cy="2276475"/>
+            <wp:effectExtent t="0" r="0" b="0" l="0"/>
+            <wp:docPr id="1" name="" descr="" title=""/>
+            <wp:cNvGraphicFramePr>
+              <a:graphicFrameLocks xmlns:a="http://schemas.openxmlformats.org/drawingml/2006/main" noChangeAspect="1"/>
+            </wp:cNvGraphicFramePr>
+            <a:graphic xmlns:a="http://schemas.openxmlformats.org/drawingml/2006/main">
+              <a:graphicData uri="http://schemas.openxmlformats.org/drawingml/2006/picture">
+                <pic:pic xmlns:pic="http://schemas.openxmlformats.org/drawingml/2006/picture">
+                  <pic:nvPicPr>
+                    <pic:cNvPr id="0" name="" descr=""/>
+                    <pic:cNvPicPr>
+                      <a:picLocks noChangeAspect="1" noChangeArrowheads="1"/>
+                    </pic:cNvPicPr>
+                  </pic:nvPicPr>
+                  <pic:blipFill>
+                    <a:blip r:embed="rId8" cstate="none"/>
+                    <a:srcRect/>
+                    <a:stretch>
+                      <a:fillRect/>
+                    </a:stretch>
+                  </pic:blipFill>
+                  <pic:spPr bwMode="auto">
+                    <a:xfrm>
+                      <a:off x="0" y="0"/>
+                      <a:ext cx="5334000" cy="2276475"/>
+                    </a:xfrm>
+                    <a:prstGeom prst="rect">
+                      <a:avLst/>
+                    </a:prstGeom>
+                  </pic:spPr>
+                </pic:pic>
+              </a:graphicData>
+            </a:graphic>
+          </wp:inline>
+        </w:drawing>
+      </w:r>
+    </w:p>
+    <w:p>
+      <w:pPr>
+        <w:spacing w:after="160"/>
+        <w:jc w:val="center"/>
+      </w:pPr>
+      <w:r>
+        <w:rPr>
+          <w:rFonts w:ascii="Times New Roman" w:cs="Times New Roman" w:eastAsia="Times New Roman" w:hAnsi="Times New Roman"/>
+          <w:i/>
+          <w:iCs/>
+          <w:sz w:val="21"/>
+          <w:szCs w:val="21"/>
+        </w:rPr>
+        <w:t xml:space="preserve">Gambar 4.1 Tren pendapatan bulanan (Total Revenue by Month)</w:t>
+      </w:r>
+    </w:p>
+    <w:p>
+      <w:pPr>
+        <w:spacing w:after="60" w:before="100"/>
+        <w:jc w:val="center"/>
+      </w:pPr>
+      <w:r>
+        <w:drawing>
+          <wp:inline distT="0" distB="0" distL="0" distR="0">
+            <wp:extent cx="4095750" cy="3009900"/>
+            <wp:effectExtent t="0" r="0" b="0" l="0"/>
+            <wp:docPr id="1" name="" descr="" title=""/>
+            <wp:cNvGraphicFramePr>
+              <a:graphicFrameLocks xmlns:a="http://schemas.openxmlformats.org/drawingml/2006/main" noChangeAspect="1"/>
+            </wp:cNvGraphicFramePr>
+            <a:graphic xmlns:a="http://schemas.openxmlformats.org/drawingml/2006/main">
+              <a:graphicData uri="http://schemas.openxmlformats.org/drawingml/2006/picture">
+                <pic:pic xmlns:pic="http://schemas.openxmlformats.org/drawingml/2006/picture">
+                  <pic:nvPicPr>
+                    <pic:cNvPr id="0" name="" descr=""/>
+                    <pic:cNvPicPr>
+                      <a:picLocks noChangeAspect="1" noChangeArrowheads="1"/>
+                    </pic:cNvPicPr>
+                  </pic:nvPicPr>
+                  <pic:blipFill>
+                    <a:blip r:embed="rId9" cstate="none"/>
+                    <a:srcRect/>
+                    <a:stretch>
+                      <a:fillRect/>
+                    </a:stretch>
+                  </pic:blipFill>
+                  <pic:spPr bwMode="auto">
+                    <a:xfrm>
+                      <a:off x="0" y="0"/>
+                      <a:ext cx="4095750" cy="3009900"/>
+                    </a:xfrm>
+                    <a:prstGeom prst="rect">
+                      <a:avLst/>
+                    </a:prstGeom>
+                  </pic:spPr>
+                </pic:pic>
+              </a:graphicData>
+            </a:graphic>
+          </wp:inline>
+        </w:drawing>
+      </w:r>
+    </w:p>
+    <w:p>
+      <w:pPr>
+        <w:spacing w:after="160"/>
+        <w:jc w:val="center"/>
+      </w:pPr>
+      <w:r>
+        <w:rPr>
+          <w:rFonts w:ascii="Times New Roman" w:cs="Times New Roman" w:eastAsia="Times New Roman" w:hAnsi="Times New Roman"/>
+          <w:i/>
+          <w:iCs/>
+          <w:sz w:val="21"/>
+          <w:szCs w:val="21"/>
+        </w:rPr>
+        <w:t xml:space="preserve">Gambar 4.2 Penjualan per produk (Total Sales by Product)</w:t>
+      </w:r>
+    </w:p>
+    <w:p>
+      <w:pPr>
+        <w:spacing w:after="60" w:before="100"/>
+        <w:jc w:val="center"/>
+      </w:pPr>
+      <w:r>
+        <w:drawing>
+          <wp:inline distT="0" distB="0" distL="0" distR="0">
+            <wp:extent cx="3810000" cy="2781300"/>
+            <wp:effectExtent t="0" r="0" b="0" l="0"/>
+            <wp:docPr id="1" name="" descr="" title=""/>
+            <wp:cNvGraphicFramePr>
+              <a:graphicFrameLocks xmlns:a="http://schemas.openxmlformats.org/drawingml/2006/main" noChangeAspect="1"/>
+            </wp:cNvGraphicFramePr>
+            <a:graphic xmlns:a="http://schemas.openxmlformats.org/drawingml/2006/main">
+              <a:graphicData uri="http://schemas.openxmlformats.org/drawingml/2006/picture">
+                <pic:pic xmlns:pic="http://schemas.openxmlformats.org/drawingml/2006/picture">
+                  <pic:nvPicPr>
+                    <pic:cNvPr id="0" name="" descr=""/>
+                    <pic:cNvPicPr>
+                      <a:picLocks noChangeAspect="1" noChangeArrowheads="1"/>
+                    </pic:cNvPicPr>
+                  </pic:nvPicPr>
+                  <pic:blipFill>
+                    <a:blip r:embed="rId10" cstate="none"/>
+                    <a:srcRect/>
+                    <a:stretch>
+                      <a:fillRect/>
+                    </a:stretch>
+                  </pic:blipFill>
+                  <pic:spPr bwMode="auto">
+                    <a:xfrm>
+                      <a:off x="0" y="0"/>
+                      <a:ext cx="3810000" cy="2781300"/>
+                    </a:xfrm>
+                    <a:prstGeom prst="rect">
+                      <a:avLst/>
+                    </a:prstGeom>
+                  </pic:spPr>
+                </pic:pic>
+              </a:graphicData>
+            </a:graphic>
+          </wp:inline>
+        </w:drawing>
+      </w:r>
+    </w:p>
+    <w:p>
+      <w:pPr>
+        <w:spacing w:after="160"/>
+        <w:jc w:val="center"/>
+      </w:pPr>
+      <w:r>
+        <w:rPr>
+          <w:rFonts w:ascii="Times New Roman" w:cs="Times New Roman" w:eastAsia="Times New Roman" w:hAnsi="Times New Roman"/>
+          <w:i/>
+          <w:iCs/>
+          <w:sz w:val="21"/>
+          <w:szCs w:val="21"/>
+        </w:rPr>
+        <w:t xml:space="preserve">Gambar 4.3 Kontribusi per kategori (Total Sales by Category)</w:t>
+      </w:r>
+    </w:p>
+    <w:p>
+      <w:pPr>
+        <w:spacing w:after="120" w:line="300"/>
+        <w:jc w:val="both"/>
+      </w:pPr>
+      <w:r>
+        <w:rPr>
+          <w:rFonts w:ascii="Times New Roman" w:cs="Times New Roman" w:eastAsia="Times New Roman" w:hAnsi="Times New Roman"/>
+        </w:rPr>
+        <w:t xml:space="preserve">Halaman ini menampilkan tren pendapatan bulanan, penjualan per produk, dan kontribusi per kategori untuk menjawab kapan penjualan tinggi, produk apa yang paling laku, dan kategori mana yang dominan.</w:t>
+      </w:r>
+    </w:p>
+    <w:p>
+      <w:pPr>
+        <w:pStyle w:val="Heading2"/>
+        <w:spacing w:after="100" w:before="200"/>
+      </w:pPr>
+      <w:r>
+        <w:rPr>
+          <w:rFonts w:ascii="Times New Roman" w:cs="Times New Roman" w:eastAsia="Times New Roman" w:hAnsi="Times New Roman"/>
+        </w:rPr>
+        <w:t xml:space="preserve">4.1.2 Customer Behavior Report</w:t>
+      </w:r>
+    </w:p>
+    <w:p>
+      <w:pPr>
+        <w:spacing w:after="60" w:before="100"/>
+        <w:jc w:val="center"/>
+      </w:pPr>
+      <w:r>
+        <w:drawing>
+          <wp:inline distT="0" distB="0" distL="0" distR="0">
+            <wp:extent cx="3810000" cy="2943225"/>
+            <wp:effectExtent t="0" r="0" b="0" l="0"/>
+            <wp:docPr id="1" name="" descr="" title=""/>
+            <wp:cNvGraphicFramePr>
+              <a:graphicFrameLocks xmlns:a="http://schemas.openxmlformats.org/drawingml/2006/main" noChangeAspect="1"/>
+            </wp:cNvGraphicFramePr>
+            <a:graphic xmlns:a="http://schemas.openxmlformats.org/drawingml/2006/main">
+              <a:graphicData uri="http://schemas.openxmlformats.org/drawingml/2006/picture">
+                <pic:pic xmlns:pic="http://schemas.openxmlformats.org/drawingml/2006/picture">
+                  <pic:nvPicPr>
+                    <pic:cNvPr id="0" name="" descr=""/>
+                    <pic:cNvPicPr>
+                      <a:picLocks noChangeAspect="1" noChangeArrowheads="1"/>
+                    </pic:cNvPicPr>
+                  </pic:nvPicPr>
+                  <pic:blipFill>
+                    <a:blip r:embed="rId11" cstate="none"/>
+                    <a:srcRect/>
+                    <a:stretch>
+                      <a:fillRect/>
+                    </a:stretch>
+                  </pic:blipFill>
+                  <pic:spPr bwMode="auto">
+                    <a:xfrm>
+                      <a:off x="0" y="0"/>
+                      <a:ext cx="3810000" cy="2943225"/>
+                    </a:xfrm>
+                    <a:prstGeom prst="rect">
+                      <a:avLst/>
+                    </a:prstGeom>
+                  </pic:spPr>
+                </pic:pic>
+              </a:graphicData>
+            </a:graphic>
+          </wp:inline>
+        </w:drawing>
+      </w:r>
+    </w:p>
+    <w:p>
+      <w:pPr>
+        <w:spacing w:after="160"/>
+        <w:jc w:val="center"/>
+      </w:pPr>
+      <w:r>
+        <w:rPr>
+          <w:rFonts w:ascii="Times New Roman" w:cs="Times New Roman" w:eastAsia="Times New Roman" w:hAnsi="Times New Roman"/>
+          <w:i/>
+          <w:iCs/>
+          <w:sz w:val="21"/>
+          <w:szCs w:val="21"/>
+        </w:rPr>
+        <w:t xml:space="preserve">Gambar 4.4 Pendapatan per pelanggan menurut wilayah (Revenue per Customer by Region)</w:t>
+      </w:r>
+    </w:p>
     <w:tbl>
       <w:tblPr>
         <w:tblW w:type="dxa" w:w="9360"/>
@@ -3397,7 +3669,7 @@
                 <w:iCs/>
                 <w:color w:val="7F7F7F"/>
               </w:rPr>
-              <w:t xml:space="preserve">[Tempel screenshot: halaman Revenue Report]</w:t>
+              <w:t xml:space="preserve">[Tempel screenshot: grafik Total Unique Customers by Region]</w:t>
             </w:r>
           </w:p>
         </w:tc>
@@ -3416,7 +3688,7 @@
           <w:sz w:val="21"/>
           <w:szCs w:val="21"/>
         </w:rPr>
-        <w:t xml:space="preserve">Gambar 4.1 Halaman Revenue Report</w:t>
+        <w:t xml:space="preserve">Gambar 4.5 Jumlah pelanggan aktif menurut wilayah (Total Unique Customers by Region)</w:t>
       </w:r>
     </w:p>
     <w:p>
@@ -3428,7 +3700,7 @@
         <w:rPr>
           <w:rFonts w:ascii="Times New Roman" w:cs="Times New Roman" w:eastAsia="Times New Roman" w:hAnsi="Times New Roman"/>
         </w:rPr>
-        <w:t xml:space="preserve">Halaman ini menampilkan tren pendapatan bulanan, penjualan per produk, dan kontribusi per kategori untuk menjawab kapan penjualan tinggi, produk apa yang paling laku, dan kategori mana yang dominan.</w:t>
+        <w:t xml:space="preserve">Halaman ini menyajikan jumlah pelanggan aktif dan rata-rata pendapatan per pelanggan menurut wilayah.</w:t>
       </w:r>
     </w:p>
     <w:p>
@@ -3440,7 +3712,7 @@
         <w:rPr>
           <w:rFonts w:ascii="Times New Roman" w:cs="Times New Roman" w:eastAsia="Times New Roman" w:hAnsi="Times New Roman"/>
         </w:rPr>
-        <w:t xml:space="preserve">4.1.2 Customer Behavior Report</w:t>
+        <w:t xml:space="preserve">4.1.3 KPI Summary</w:t>
       </w:r>
     </w:p>
     <w:tbl>
@@ -3484,7 +3756,7 @@
                 <w:iCs/>
                 <w:color w:val="7F7F7F"/>
               </w:rPr>
-              <w:t xml:space="preserve">[Tempel screenshot: halaman Customer Behavior Report]</w:t>
+              <w:t xml:space="preserve">[Tempel screenshot: halaman KPI Summary]</w:t>
             </w:r>
           </w:p>
         </w:tc>
@@ -3503,94 +3775,7 @@
           <w:sz w:val="21"/>
           <w:szCs w:val="21"/>
         </w:rPr>
-        <w:t xml:space="preserve">Gambar 4.2 Halaman Customer Behavior Report</w:t>
-      </w:r>
-    </w:p>
-    <w:p>
-      <w:pPr>
-        <w:spacing w:after="120" w:line="300"/>
-        <w:jc w:val="both"/>
-      </w:pPr>
-      <w:r>
-        <w:rPr>
-          <w:rFonts w:ascii="Times New Roman" w:cs="Times New Roman" w:eastAsia="Times New Roman" w:hAnsi="Times New Roman"/>
-        </w:rPr>
-        <w:t xml:space="preserve">Halaman ini menyajikan jumlah pelanggan aktif dan rata-rata pendapatan per pelanggan menurut wilayah.</w:t>
-      </w:r>
-    </w:p>
-    <w:p>
-      <w:pPr>
-        <w:pStyle w:val="Heading2"/>
-        <w:spacing w:after="100" w:before="200"/>
-      </w:pPr>
-      <w:r>
-        <w:rPr>
-          <w:rFonts w:ascii="Times New Roman" w:cs="Times New Roman" w:eastAsia="Times New Roman" w:hAnsi="Times New Roman"/>
-        </w:rPr>
-        <w:t xml:space="preserve">4.1.3 KPI Summary</w:t>
-      </w:r>
-    </w:p>
-    <w:tbl>
-      <w:tblPr>
-        <w:tblW w:type="dxa" w:w="9360"/>
-        <w:tblBorders>
-          <w:top w:val="single" w:color="auto" w:sz="4"/>
-          <w:left w:val="single" w:color="auto" w:sz="4"/>
-          <w:bottom w:val="single" w:color="auto" w:sz="4"/>
-          <w:right w:val="single" w:color="auto" w:sz="4"/>
-          <w:insideH w:val="single" w:color="auto" w:sz="4"/>
-          <w:insideV w:val="single" w:color="auto" w:sz="4"/>
-        </w:tblBorders>
-      </w:tblPr>
-      <w:tblGrid>
-        <w:gridCol w:w="9360"/>
-      </w:tblGrid>
-      <w:tr>
-        <w:trPr>
-          <w:trHeight w:val="3400" w:hRule="atLeast"/>
-        </w:trPr>
-        <w:tc>
-          <w:tcPr>
-            <w:tcW w:type="dxa" w:w="9360"/>
-            <w:tcBorders>
-              <w:top w:val="dashed" w:color="7F7F7F" w:sz="6"/>
-              <w:left w:val="dashed" w:color="7F7F7F" w:sz="6"/>
-              <w:bottom w:val="dashed" w:color="7F7F7F" w:sz="6"/>
-              <w:right w:val="dashed" w:color="7F7F7F" w:sz="6"/>
-            </w:tcBorders>
-            <w:vAlign w:val="center"/>
-          </w:tcPr>
-          <w:p>
-            <w:pPr>
-              <w:jc w:val="center"/>
-            </w:pPr>
-            <w:r>
-              <w:rPr>
-                <w:rFonts w:ascii="Times New Roman" w:cs="Times New Roman" w:eastAsia="Times New Roman" w:hAnsi="Times New Roman"/>
-                <w:i/>
-                <w:iCs/>
-                <w:color w:val="7F7F7F"/>
-              </w:rPr>
-              <w:t xml:space="preserve">[Tempel screenshot: halaman KPI Summary]</w:t>
-            </w:r>
-          </w:p>
-        </w:tc>
-      </w:tr>
-    </w:tbl>
-    <w:p>
-      <w:pPr>
-        <w:spacing w:after="160" w:before="80"/>
-        <w:jc w:val="center"/>
-      </w:pPr>
-      <w:r>
-        <w:rPr>
-          <w:rFonts w:ascii="Times New Roman" w:cs="Times New Roman" w:eastAsia="Times New Roman" w:hAnsi="Times New Roman"/>
-          <w:i/>
-          <w:iCs/>
-          <w:sz w:val="21"/>
-          <w:szCs w:val="21"/>
-        </w:rPr>
-        <w:t xml:space="preserve">Gambar 4.3 Halaman KPI Summary</w:t>
+        <w:t xml:space="preserve">Gambar 4.6 Halaman KPI Summary</w:t>
       </w:r>
     </w:p>
     <w:p>

</xml_diff>